<commit_message>
Analyst's Case File: Number Guesser
Added a Analyst's Case File for Number Guesser.
</commit_message>
<xml_diff>
--- a/m1lab/case-file-template.docx
+++ b/m1lab/case-file-template.docx
@@ -88,6 +88,7 @@
             </w:tcMar>
           </w:tcPr>
           <w:p>
+            <w:proofErr w:type="spellStart"/>
             <w:r>
               <w:rPr>
                 <w:b/>
@@ -95,7 +96,17 @@
                 <w:sz w:val="19"/>
                 <w:szCs w:val="19"/>
               </w:rPr>
-              <w:t>DataMan (Texas Instruments, 1977)</w:t>
+              <w:t>DataMan</w:t>
+            </w:r>
+            <w:proofErr w:type="spellEnd"/>
+            <w:r>
+              <w:rPr>
+                <w:b/>
+                <w:bCs/>
+                <w:sz w:val="19"/>
+                <w:szCs w:val="19"/>
+              </w:rPr>
+              <w:t xml:space="preserve"> (Texas Instruments, 1977)</w:t>
             </w:r>
           </w:p>
         </w:tc>
@@ -251,7 +262,27 @@
                 <w:sz w:val="19"/>
                 <w:szCs w:val="19"/>
               </w:rPr>
-              <w:t>The Story of DataMan — manual transcript</w:t>
+              <w:t xml:space="preserve">The Story of </w:t>
+            </w:r>
+            <w:proofErr w:type="spellStart"/>
+            <w:r>
+              <w:rPr>
+                <w:b/>
+                <w:bCs/>
+                <w:sz w:val="19"/>
+                <w:szCs w:val="19"/>
+              </w:rPr>
+              <w:t>DataMan</w:t>
+            </w:r>
+            <w:proofErr w:type="spellEnd"/>
+            <w:r>
+              <w:rPr>
+                <w:b/>
+                <w:bCs/>
+                <w:sz w:val="19"/>
+                <w:szCs w:val="19"/>
+              </w:rPr>
+              <w:t xml:space="preserve"> — manual transcript</w:t>
             </w:r>
           </w:p>
         </w:tc>
@@ -429,7 +460,23 @@
         <w:spacing w:after="140"/>
       </w:pPr>
       <w:r>
-        <w:t>Read both registers before you write anything. Part I describes the feature to a child. Part II describes it to an adult. Each contains information the other omits.</w:t>
+        <w:t xml:space="preserve">Read both registers before you write anything. Part I describes the </w:t>
+      </w:r>
+      <w:proofErr w:type="gramStart"/>
+      <w:r>
+        <w:t>feature</w:t>
+      </w:r>
+      <w:proofErr w:type="gramEnd"/>
+      <w:r>
+        <w:t xml:space="preserve"> </w:t>
+      </w:r>
+      <w:proofErr w:type="gramStart"/>
+      <w:r>
+        <w:t>to</w:t>
+      </w:r>
+      <w:proofErr w:type="gramEnd"/>
+      <w:r>
+        <w:t xml:space="preserve"> a child. Part II describes it to an adult. Each contains information the other omits.</w:t>
       </w:r>
     </w:p>
     <w:p>
@@ -695,7 +742,15 @@
           </w:tcPr>
           <w:p>
             <w:r>
-              <w:t>A fun strategy game to for the family to enjoy.</w:t>
+              <w:t xml:space="preserve">A fun strategy </w:t>
+            </w:r>
+            <w:proofErr w:type="gramStart"/>
+            <w:r>
+              <w:t>game to</w:t>
+            </w:r>
+            <w:proofErr w:type="gramEnd"/>
+            <w:r>
+              <w:t xml:space="preserve"> for the family to enjoy.</w:t>
             </w:r>
           </w:p>
         </w:tc>
@@ -893,7 +948,15 @@
           </w:tcPr>
           <w:p>
             <w:r>
-              <w:t>The calculator (Dataman)</w:t>
+              <w:t>The calculator (</w:t>
+            </w:r>
+            <w:proofErr w:type="spellStart"/>
+            <w:r>
+              <w:t>Dataman</w:t>
+            </w:r>
+            <w:proofErr w:type="spellEnd"/>
+            <w:r>
+              <w:t>)</w:t>
             </w:r>
           </w:p>
         </w:tc>
@@ -1727,10 +1790,7 @@
           </w:tcPr>
           <w:p>
             <w:r>
-              <w:t>Pick a new number</w:t>
-            </w:r>
-            <w:r>
-              <w:t xml:space="preserve"> each time the player presses ???</w:t>
+              <w:t>The secret number is in the 9-100 range.</w:t>
             </w:r>
           </w:p>
         </w:tc>
@@ -1746,7 +1806,10 @@
           </w:tcPr>
           <w:p>
             <w:r>
-              <w:t>“I’ll pick a new number each time you press ???”</w:t>
+              <w:t xml:space="preserve">The calculator </w:t>
+            </w:r>
+            <w:r>
+              <w:t>picks a number between 9 and 100.</w:t>
             </w:r>
           </w:p>
         </w:tc>
@@ -1781,7 +1844,11 @@
               <w:right w:w="110" w:type="dxa"/>
             </w:tcMar>
           </w:tcPr>
-          <w:p/>
+          <w:p>
+            <w:r>
+              <w:t>A new round starts when the player presses the Number Guesser key.</w:t>
+            </w:r>
+          </w:p>
         </w:tc>
         <w:tc>
           <w:tcPr>
@@ -1793,7 +1860,11 @@
               <w:right w:w="110" w:type="dxa"/>
             </w:tcMar>
           </w:tcPr>
-          <w:p/>
+          <w:p>
+            <w:r>
+              <w:t>I’ll pick a number each time you press ???</w:t>
+            </w:r>
+          </w:p>
         </w:tc>
         <w:tc>
           <w:tcPr>
@@ -1805,7 +1876,11 @@
               <w:right w:w="110" w:type="dxa"/>
             </w:tcMar>
           </w:tcPr>
-          <w:p/>
+          <w:p>
+            <w:r>
+              <w:t>Number Guesser (story)</w:t>
+            </w:r>
+          </w:p>
         </w:tc>
       </w:tr>
       <w:tr>
@@ -2126,7 +2201,15 @@
           </w:tcPr>
           <w:p>
             <w:r>
-              <w:t>“show you two numbers in my face mask</w:t>
+              <w:t>“</w:t>
+            </w:r>
+            <w:proofErr w:type="gramStart"/>
+            <w:r>
+              <w:t>show</w:t>
+            </w:r>
+            <w:proofErr w:type="gramEnd"/>
+            <w:r>
+              <w:t xml:space="preserve"> you two numbers in my face mask</w:t>
             </w:r>
             <w:r>
               <w:t>”</w:t>
@@ -2209,6 +2292,7 @@
             <w:r>
               <w:t>“</w:t>
             </w:r>
+            <w:proofErr w:type="spellStart"/>
             <w:r>
               <w:t>Data</w:t>
             </w:r>
@@ -2216,7 +2300,11 @@
               <w:t>M</w:t>
             </w:r>
             <w:r>
-              <w:t>an rewards you with a spectacular “light show”</w:t>
+              <w:t>an</w:t>
+            </w:r>
+            <w:proofErr w:type="spellEnd"/>
+            <w:r>
+              <w:t xml:space="preserve"> rewards you with a spectacular “light show”</w:t>
             </w:r>
             <w:r>
               <w:t xml:space="preserve"> and displays the total number of guesses that were taken.”</w:t>
@@ -2467,7 +2555,14 @@
               <w:right w:w="110" w:type="dxa"/>
             </w:tcMar>
           </w:tcPr>
-          <w:p/>
+          <w:p>
+            <w:r>
+              <w:t>Two</w:t>
+            </w:r>
+            <w:r>
+              <w:t xml:space="preserve"> number hint</w:t>
+            </w:r>
+          </w:p>
         </w:tc>
         <w:tc>
           <w:tcPr>
@@ -2479,7 +2574,22 @@
               <w:right w:w="110" w:type="dxa"/>
             </w:tcMar>
           </w:tcPr>
-          <w:p/>
+          <w:p>
+            <w:r>
+              <w:t xml:space="preserve">The two numbers provide feedback after the </w:t>
+            </w:r>
+            <w:r>
+              <w:t xml:space="preserve">player </w:t>
+            </w:r>
+            <w:proofErr w:type="gramStart"/>
+            <w:r>
+              <w:t>enter</w:t>
+            </w:r>
+            <w:proofErr w:type="gramEnd"/>
+            <w:r>
+              <w:t xml:space="preserve"> a guess.</w:t>
+            </w:r>
+          </w:p>
         </w:tc>
         <w:tc>
           <w:tcPr>
@@ -2491,7 +2601,19 @@
               <w:right w:w="110" w:type="dxa"/>
             </w:tcMar>
           </w:tcPr>
-          <w:p/>
+          <w:p>
+            <w:r>
+              <w:t>“</w:t>
+            </w:r>
+            <w:proofErr w:type="gramStart"/>
+            <w:r>
+              <w:t>show</w:t>
+            </w:r>
+            <w:proofErr w:type="gramEnd"/>
+            <w:r>
+              <w:t xml:space="preserve"> you to numbers in my face mask”</w:t>
+            </w:r>
+          </w:p>
         </w:tc>
         <w:tc>
           <w:tcPr>
@@ -2503,7 +2625,11 @@
               <w:right w:w="110" w:type="dxa"/>
             </w:tcMar>
           </w:tcPr>
-          <w:p/>
+          <w:p>
+            <w:r>
+              <w:t>Number Guesser (Story)</w:t>
+            </w:r>
+          </w:p>
         </w:tc>
       </w:tr>
       <w:tr>
@@ -2689,10 +2815,33 @@
           </w:tcPr>
           <w:p>
             <w:r>
-              <w:t xml:space="preserve">Does Dataman </w:t>
-            </w:r>
-            <w:r>
-              <w:t>hold previous number inputs executed by the player and display it?</w:t>
+              <w:t>The calculator</w:t>
+            </w:r>
+            <w:r>
+              <w:t xml:space="preserve"> </w:t>
+            </w:r>
+            <w:r>
+              <w:t>holds</w:t>
+            </w:r>
+            <w:r>
+              <w:t xml:space="preserve"> previous number inputs e</w:t>
+            </w:r>
+            <w:r>
+              <w:t xml:space="preserve">ntered </w:t>
+            </w:r>
+            <w:r>
+              <w:t xml:space="preserve">by the player and </w:t>
+            </w:r>
+            <w:proofErr w:type="gramStart"/>
+            <w:r>
+              <w:t>display</w:t>
+            </w:r>
+            <w:proofErr w:type="gramEnd"/>
+            <w:r>
+              <w:t xml:space="preserve"> </w:t>
+            </w:r>
+            <w:r>
+              <w:t>them.</w:t>
             </w:r>
           </w:p>
         </w:tc>
@@ -2727,10 +2876,13 @@
               <w:t xml:space="preserve">The operating notes would need to explain the </w:t>
             </w:r>
             <w:r>
-              <w:t>details of previous inputs</w:t>
-            </w:r>
-            <w:r>
-              <w:t>.</w:t>
+              <w:t xml:space="preserve">details of </w:t>
+            </w:r>
+            <w:r>
+              <w:t>how previous inputs are stored</w:t>
+            </w:r>
+            <w:r>
+              <w:t xml:space="preserve"> or displayed.</w:t>
             </w:r>
           </w:p>
         </w:tc>
@@ -2751,13 +2903,25 @@
           </w:tcPr>
           <w:p>
             <w:r>
-              <w:t xml:space="preserve">Dataman </w:t>
+              <w:t>The calculat</w:t>
+            </w:r>
+            <w:r>
+              <w:t>or</w:t>
+            </w:r>
+            <w:r>
+              <w:t xml:space="preserve"> </w:t>
             </w:r>
             <w:r>
               <w:t>handles</w:t>
             </w:r>
             <w:r>
-              <w:t xml:space="preserve"> error handl</w:t>
+              <w:t xml:space="preserve"> </w:t>
+            </w:r>
+            <w:r>
+              <w:t xml:space="preserve">an </w:t>
+            </w:r>
+            <w:r>
+              <w:t>error handl</w:t>
             </w:r>
             <w:r>
               <w:t xml:space="preserve">ing </w:t>
@@ -2874,6 +3038,7 @@
         <w:spacing w:after="140"/>
       </w:pPr>
       <w:r>
+        <w:lastRenderedPageBreak/>
         <w:t>What could not be determined from the manual? For each, state what you looked for and where you looked, so a reader knows the gap is real and not merely unsearched.</w:t>
       </w:r>
     </w:p>
@@ -2922,7 +3087,6 @@
                 <w:sz w:val="19"/>
                 <w:szCs w:val="19"/>
               </w:rPr>
-              <w:lastRenderedPageBreak/>
               <w:t>Open question</w:t>
             </w:r>
           </w:p>
@@ -3092,6 +3256,7 @@
             </w:tcMar>
           </w:tcPr>
           <w:p>
+            <w:proofErr w:type="gramStart"/>
             <w:r>
               <w:t>The story and manual</w:t>
             </w:r>
@@ -3101,51 +3266,11 @@
             <w:r>
               <w:t>do</w:t>
             </w:r>
+            <w:proofErr w:type="gramEnd"/>
             <w:r>
               <w:t xml:space="preserve"> not describe the difference in light show appearance?</w:t>
             </w:r>
           </w:p>
-        </w:tc>
-      </w:tr>
-      <w:tr>
-        <w:trPr>
-          <w:trHeight w:val="520"/>
-        </w:trPr>
-        <w:tc>
-          <w:tcPr>
-            <w:tcW w:w="3200" w:type="dxa"/>
-            <w:tcMar>
-              <w:top w:w="80" w:type="dxa"/>
-              <w:left w:w="110" w:type="dxa"/>
-              <w:bottom w:w="80" w:type="dxa"/>
-              <w:right w:w="110" w:type="dxa"/>
-            </w:tcMar>
-          </w:tcPr>
-          <w:p/>
-        </w:tc>
-        <w:tc>
-          <w:tcPr>
-            <w:tcW w:w="2800" w:type="dxa"/>
-            <w:tcMar>
-              <w:top w:w="80" w:type="dxa"/>
-              <w:left w:w="110" w:type="dxa"/>
-              <w:bottom w:w="80" w:type="dxa"/>
-              <w:right w:w="110" w:type="dxa"/>
-            </w:tcMar>
-          </w:tcPr>
-          <w:p/>
-        </w:tc>
-        <w:tc>
-          <w:tcPr>
-            <w:tcW w:w="3360" w:type="dxa"/>
-            <w:tcMar>
-              <w:top w:w="80" w:type="dxa"/>
-              <w:left w:w="110" w:type="dxa"/>
-              <w:bottom w:w="80" w:type="dxa"/>
-              <w:right w:w="110" w:type="dxa"/>
-            </w:tcMar>
-          </w:tcPr>
-          <w:p/>
         </w:tc>
       </w:tr>
     </w:tbl>
@@ -3169,6 +3294,10 @@
     <w:p>
       <w:pPr>
         <w:spacing w:after="60"/>
+        <w:rPr>
+          <w:b/>
+          <w:bCs/>
+        </w:rPr>
       </w:pPr>
       <w:r>
         <w:rPr>
@@ -3180,27 +3309,18 @@
     </w:p>
     <w:p>
       <w:pPr>
+        <w:spacing w:after="60"/>
+      </w:pPr>
+    </w:p>
+    <w:p>
+      <w:pPr>
         <w:pBdr>
           <w:bottom w:val="single" w:sz="4" w:space="0" w:color="AAB4C0"/>
         </w:pBdr>
         <w:spacing w:after="200"/>
       </w:pPr>
-    </w:p>
-    <w:p>
-      <w:pPr>
-        <w:pBdr>
-          <w:bottom w:val="single" w:sz="4" w:space="0" w:color="AAB4C0"/>
-        </w:pBdr>
-        <w:spacing w:after="200"/>
-      </w:pPr>
-      <w:r>
-        <w:t>The story mentions a flash appears when the user</w:t>
-      </w:r>
-      <w:r>
-        <w:t xml:space="preserve"> guesses the secret number wrong and</w:t>
-      </w:r>
-      <w:r>
-        <w:t xml:space="preserve"> right. The operating notes only mentions the flash when the user guesses the secret number right.</w:t>
+      <w:r>
+        <w:t>The Story describes what happens after the player enters a guess, including a flash and two numbers displayed in the face mask. The Operating Notes focus on what happens when the secret number is found, including the light show and total number of guesses.</w:t>
       </w:r>
     </w:p>
     <w:p>
@@ -3212,7 +3332,23 @@
           <w:b/>
           <w:bCs/>
         </w:rPr>
-        <w:t>Part I says (quote):</w:t>
+        <w:t xml:space="preserve">Part I </w:t>
+      </w:r>
+      <w:proofErr w:type="gramStart"/>
+      <w:r>
+        <w:rPr>
+          <w:b/>
+          <w:bCs/>
+        </w:rPr>
+        <w:t>says</w:t>
+      </w:r>
+      <w:proofErr w:type="gramEnd"/>
+      <w:r>
+        <w:rPr>
+          <w:b/>
+          <w:bCs/>
+        </w:rPr>
+        <w:t xml:space="preserve"> (quote):</w:t>
       </w:r>
     </w:p>
     <w:p>
@@ -3277,7 +3413,15 @@
         <w:t>“When the secret number is found</w:t>
       </w:r>
       <w:r>
-        <w:t>, DataMan rewards you with a spectacular</w:t>
+        <w:t xml:space="preserve">, </w:t>
+      </w:r>
+      <w:proofErr w:type="spellStart"/>
+      <w:r>
+        <w:t>DataMan</w:t>
+      </w:r>
+      <w:proofErr w:type="spellEnd"/>
+      <w:r>
+        <w:t xml:space="preserve"> rewards you with a spectacular</w:t>
       </w:r>
       <w:r>
         <w:t xml:space="preserve"> “light show” and displays the total number of guesses that were taken.”</w:t>
@@ -3292,7 +3436,39 @@
           <w:b/>
           <w:bCs/>
         </w:rPr>
-        <w:t>Why this matters to an analyst:</w:t>
+        <w:t xml:space="preserve">Why </w:t>
+      </w:r>
+      <w:proofErr w:type="gramStart"/>
+      <w:r>
+        <w:rPr>
+          <w:b/>
+          <w:bCs/>
+        </w:rPr>
+        <w:t>this</w:t>
+      </w:r>
+      <w:proofErr w:type="gramEnd"/>
+      <w:r>
+        <w:rPr>
+          <w:b/>
+          <w:bCs/>
+        </w:rPr>
+        <w:t xml:space="preserve"> </w:t>
+      </w:r>
+      <w:proofErr w:type="gramStart"/>
+      <w:r>
+        <w:rPr>
+          <w:b/>
+          <w:bCs/>
+        </w:rPr>
+        <w:t>matters</w:t>
+      </w:r>
+      <w:proofErr w:type="gramEnd"/>
+      <w:r>
+        <w:rPr>
+          <w:b/>
+          <w:bCs/>
+        </w:rPr>
+        <w:t xml:space="preserve"> to an analyst:</w:t>
       </w:r>
     </w:p>
     <w:p>
@@ -3311,31 +3487,13 @@
         <w:spacing w:after="200"/>
       </w:pPr>
       <w:r>
-        <w:t>If an analyst only reads the notes without reading the story</w:t>
-      </w:r>
-      <w:r>
-        <w:t>, they</w:t>
-      </w:r>
-      <w:r>
-        <w:t xml:space="preserve"> may get</w:t>
-      </w:r>
-      <w:r>
-        <w:t xml:space="preserve"> confused </w:t>
-      </w:r>
-      <w:r>
-        <w:t xml:space="preserve">about what the flashing </w:t>
-      </w:r>
-      <w:r>
-        <w:t>could mean. The operating notes focus on what happens when the secret number is found</w:t>
-      </w:r>
-      <w:r>
-        <w:t xml:space="preserve">, while the story gives more detail about what happens during the </w:t>
-      </w:r>
-      <w:r>
-        <w:t>guessing</w:t>
-      </w:r>
-      <w:r>
-        <w:t xml:space="preserve"> process.</w:t>
+        <w:t xml:space="preserve">The two </w:t>
+      </w:r>
+      <w:r>
+        <w:t>quotes</w:t>
+      </w:r>
+      <w:r>
+        <w:t xml:space="preserve"> describe different parts of the guessing process. The Story provides more detail about the player's interaction during a guess, while the Operating Notes describe the result when the secret number is found. The manual does not establish that the flash represents separate wrong-guess and right-guess states.</w:t>
       </w:r>
     </w:p>
     <w:p>
@@ -3370,7 +3528,15 @@
         <w:spacing w:after="80"/>
       </w:pPr>
       <w:r>
-        <w:t>Every quote names the section it came from.</w:t>
+        <w:t xml:space="preserve">Every quote </w:t>
+      </w:r>
+      <w:proofErr w:type="gramStart"/>
+      <w:r>
+        <w:t>names</w:t>
+      </w:r>
+      <w:proofErr w:type="gramEnd"/>
+      <w:r>
+        <w:t xml:space="preserve"> the section it came from.</w:t>
       </w:r>
     </w:p>
     <w:p>
@@ -4071,7 +4237,6 @@
   <w:style w:type="character" w:default="1" w:styleId="DefaultParagraphFont">
     <w:name w:val="Default Paragraph Font"/>
     <w:uiPriority w:val="1"/>
-    <w:semiHidden/>
     <w:unhideWhenUsed/>
   </w:style>
   <w:style w:type="table" w:default="1" w:styleId="TableNormal">

</xml_diff>